<commit_message>
Actividad 3 y 5 actualizada
</commit_message>
<xml_diff>
--- a/Actividades/Actividad_5.docx
+++ b/Actividades/Actividad_5.docx
@@ -5364,7 +5364,23 @@
           <w:sz w:val="24"/>
           <w:szCs w:val="24"/>
         </w:rPr>
-        <w:t>Evaluados sobre la arquitectura de 3 capas (Next.js + Spring Boot + PostgreSQL) y la integración con WhatsApp Business API:</w:t>
+        <w:t>Evaluados sobre la arquitectura de 3 capas (</w:t>
+      </w:r>
+      <w:r>
+        <w:rPr>
+          <w:rFonts w:ascii="Times New Roman" w:eastAsia="Times New Roman" w:hAnsi="Times New Roman" w:cs="Times New Roman"/>
+          <w:sz w:val="24"/>
+          <w:szCs w:val="24"/>
+        </w:rPr>
+        <w:t>Angular</w:t>
+      </w:r>
+      <w:r>
+        <w:rPr>
+          <w:rFonts w:ascii="Times New Roman" w:eastAsia="Times New Roman" w:hAnsi="Times New Roman" w:cs="Times New Roman"/>
+          <w:sz w:val="24"/>
+          <w:szCs w:val="24"/>
+        </w:rPr>
+        <w:t xml:space="preserve"> + Spring Boot + PostgreSQL) y la integración con WhatsApp Business API:</w:t>
       </w:r>
     </w:p>
     <w:tbl>

</xml_diff>